<commit_message>
court(pacommwct): motion and amicus briefs gated, second pass
The shared model of fb-595.54.82 breaks URLs alike in every engine and pdfLaTeX now keeps the
amicus brief's long audit URL inside the margin (DEF-FORM-002): latex and docx regenerated, the
amicus latex/ committed (tier 1 0 failed). motion-brief passes XENG-001..003 on latex and docx;
amicus-brief passes on docx and gates it, its latex reported (the break after a slash inside
an italic case name, request 6 of docs/open-items/fb-595.54.45.md, unchanged).

Co-Authored-By: Claude Opus 5.5 <noreply@anthropic.com>

(fb-595.54.45)
</commit_message>
<xml_diff>
--- a/courts/third-circuit/pennsylvania/state/commonwealth-court/amicus-brief/usage/OUTPUT-amicus-brief.docx
+++ b/courts/third-circuit/pennsylvania/state/commonwealth-court/amicus-brief/usage/OUTPUT-amicus-brief.docx
@@ -5748,7 +5748,7 @@
         <w:pStyle w:val="BodyText"/>
       </w:pPr>
       <w:r>
-        <w:t xml:space="preserve">Furthermore, DOS offers the entire statewide registered voter list for public sale, which includes all of the following voter data: voter ID number, name, sex, date of birth, date registered, status (i.e., active or inactive), date status last changed, party, residential address, mailing address, polling place, date last voted, all districts in which the voter votes (i.e., congressional, legislative, school district, etc.), voter history, and date the voter’s record was last changed. https://www.pavoterservices.pa.gov/​Pages/​PurchasePAFULLVoterExport.aspx (last accessed Sept. 28, 2021) (screenshot below);</w:t>
+        <w:t xml:space="preserve">Furthermore, DOS offers the entire statewide registered voter list for public sale, which includes all of the following voter data: voter ID number, name, sex, date of birth, date registered, status (i.e., active or inactive), date status last changed, party, residential address, mailing address, polling place, date last voted, all districts in which the voter votes (i.e., congressional, legislative, school district, etc.), voter history, and date the voter’s record was last changed. https://​www.​pavoterservices.​pa.​gov/​Pages/​PurchasePAFULLVoterExport.​aspx (last accessed Sept. 28, 2021) (screenshot below);</w:t>
       </w:r>
       <w:r>
         <w:t xml:space="preserve"> </w:t>
@@ -6346,7 +6346,7 @@
         <w:pStyle w:val="BodyText"/>
       </w:pPr>
       <w:r>
-        <w:t xml:space="preserve">Later, DOS performed a second analysis using voter registration data and motor vehicle records to determine if non-citizens had registered to vote. This second analysis was allegedly done in consultation with an unidentified “expert,” who was not a DOS employee, but rather a “tenured Associate Professor of Political Science.” Performance Audit Report at 162, Statewide Uniform Registry of Electors, Dec. 2019, available at https://www.paauditor.gov/​Media/​Default/​Reports/​Department%20of%20State_SURE%20Audit%20Report%2012</w:t>
+        <w:t xml:space="preserve">Later, DOS performed a second analysis using voter registration data and motor vehicle records to determine if non-citizens had registered to vote. This second analysis was allegedly done in consultation with an unidentified “expert,” who was not a DOS employee, but rather a “tenured Associate Professor of Political Science.” Performance Audit Report at 162, Statewide Uniform Registry of Electors, Dec. 2019, available at https://​www.​paauditor.​gov/​Media/​Default/​Reports/​Department%20of%20State_SURE%20Audit%20Report%2012</w:t>
       </w:r>
       <w:r>
         <w:noBreakHyphen/>
@@ -6358,7 +6358,7 @@
         <w:noBreakHyphen/>
       </w:r>
       <w:r>
-        <w:t xml:space="preserve">19.pdf (last accessed Sept. 28, 2021). In addition to working with PennDOT to correct the issue, DOS management stated that steps were taken to investigate and address the concern that non-citizens were registered to vote.</w:t>
+        <w:t xml:space="preserve">19.​pdf (last accessed Sept. 28, 2021). In addition to working with PennDOT to correct the issue, DOS management stated that steps were taken to investigate and address the concern that non-citizens were registered to vote.</w:t>
       </w:r>
     </w:p>
     <w:p>
@@ -6379,7 +6379,7 @@
         <w:t xml:space="preserve">Home</w:t>
       </w:r>
       <w:r>
-        <w:t xml:space="preserve">, ERIC, https://ericstates.org/;</w:t>
+        <w:t xml:space="preserve">, ERIC, https://​ericstates.​org/​;</w:t>
       </w:r>
       <w:r>
         <w:t xml:space="preserve"> </w:t>
@@ -6392,7 +6392,7 @@
         <w:t xml:space="preserve">FAQs, What Data Does ERIC Collect From Member States?</w:t>
       </w:r>
       <w:r>
-        <w:t xml:space="preserve">, ERIC, https://ericstates.org/ (emphasis added).</w:t>
+        <w:t xml:space="preserve">, ERIC, https://​ericstates.​org/ (emphasis added).</w:t>
       </w:r>
     </w:p>
     <w:p>
@@ -6416,13 +6416,13 @@
         <w:t xml:space="preserve"> </w:t>
       </w:r>
       <w:r>
-        <w:t xml:space="preserve">ERIC Membership Agreement at 4(a), https://ericstates.org/​wp-content/​uploads/2020/02/​ERIC_Bylaws_01</w:t>
+        <w:t xml:space="preserve">ERIC Membership Agreement at 4(a), https://​ericstates.​org/​wp-​content/​uploads/​2020/​02/​ERIC_Bylaws_01</w:t>
       </w:r>
       <w:r>
         <w:noBreakHyphen/>
       </w:r>
       <w:r>
-        <w:t xml:space="preserve">2020.pdf (last accessed Sept. 27, 2021).</w:t>
+        <w:t xml:space="preserve">2020.​pdf (last accessed Sept. 27, 2021).</w:t>
       </w:r>
     </w:p>
     <w:p>
@@ -6910,13 +6910,7 @@
         <w:pStyle w:val="BodyText"/>
       </w:pPr>
       <w:r>
-        <w:t xml:space="preserve">Petitioners concede that names, addresses, dates of birth, and voting histories of all registered voters is a matter of public record in the Commonwealth. Petition ¶¶ 106</w:t>
-      </w:r>
-      <w:r>
-        <w:noBreakHyphen/>
-      </w:r>
-      <w:r>
-        <w:t xml:space="preserve">07 (citing 25 Pa.C.S. § 1404(a);</w:t>
+        <w:t xml:space="preserve">Petitioners concede that names, addresses, dates of birth, and voting histories of all registered voters is a matter of public record in the Commonwealth. Petition ¶¶ 106-⁠07 (citing 25 Pa.C.S. § 1404(a);</w:t>
       </w:r>
       <w:r>
         <w:t xml:space="preserve"> </w:t>
@@ -8914,6 +8908,7 @@
     <w:unhideWhenUsed/>
     <w:qFormat/>
     <w:pPr>
+      <w:keepLines/>
       <w:spacing w:before="0" w:after="140" w:line="276" w:lineRule="exact"/>
     </w:pPr>
     <w:rPr>
@@ -9164,6 +9159,33 @@
     <w:pPr>
       <w:spacing w:before="0" w:after="0" w:line="322" w:lineRule="exact"/>
       <w:ind w:left="2160" w:hanging="720"/>
+    </w:pPr>
+  </w:style>
+  <w:style w:type="paragraph" w:customStyle="1" w:styleId="XdQuoteList1">
+    <w:name w:val="Xd Quote List 1"/>
+    <w:basedOn w:val="Normal"/>
+    <w:qFormat/>
+    <w:pPr>
+      <w:spacing w:before="0" w:after="0" w:line="322" w:lineRule="exact"/>
+      <w:ind w:left="2160" w:right="1440" w:hanging="720"/>
+    </w:pPr>
+  </w:style>
+  <w:style w:type="paragraph" w:customStyle="1" w:styleId="XdQuoteList2">
+    <w:name w:val="Xd Quote List 2"/>
+    <w:basedOn w:val="Normal"/>
+    <w:qFormat/>
+    <w:pPr>
+      <w:spacing w:before="0" w:after="0" w:line="322" w:lineRule="exact"/>
+      <w:ind w:left="2880" w:right="1440" w:hanging="720"/>
+    </w:pPr>
+  </w:style>
+  <w:style w:type="paragraph" w:customStyle="1" w:styleId="XdQuoteList3">
+    <w:name w:val="Xd Quote List 3"/>
+    <w:basedOn w:val="Normal"/>
+    <w:qFormat/>
+    <w:pPr>
+      <w:spacing w:before="0" w:after="0" w:line="322" w:lineRule="exact"/>
+      <w:ind w:left="3600" w:right="1440" w:hanging="720"/>
     </w:pPr>
   </w:style>
   <w:style w:type="paragraph" w:customStyle="1" w:styleId="XdQuoteOnly">

</xml_diff>